<commit_message>
docs: ahora si correccion final del documento
</commit_message>
<xml_diff>
--- a/Informe Git y GitHub - Damian Escobar.docx
+++ b/Informe Git y GitHub - Damian Escobar.docx
@@ -7,40 +7,40 @@
         <w:pStyle w:val="Ttulo1"/>
         <w:jc w:val="center"/>
         <w:rPr>
-          <w:rFonts w:eastAsia="Roboto"/>
+          <w:rFonts w:ascii="Arial" w:eastAsia="Roboto" w:hAnsi="Arial" w:cs="Arial"/>
         </w:rPr>
       </w:pPr>
       <w:bookmarkStart w:id="0" w:name="_heading=h.p3lzcltj6olt" w:colFirst="0" w:colLast="0"/>
       <w:bookmarkEnd w:id="0"/>
       <w:r>
         <w:rPr>
-          <w:rFonts w:eastAsia="Roboto"/>
+          <w:rFonts w:ascii="Arial" w:eastAsia="Roboto" w:hAnsi="Arial" w:cs="Arial"/>
         </w:rPr>
         <w:t>Informe</w:t>
       </w:r>
       <w:r>
         <w:rPr>
-          <w:rFonts w:eastAsia="Roboto"/>
+          <w:rFonts w:ascii="Arial" w:eastAsia="Roboto" w:hAnsi="Arial" w:cs="Arial"/>
         </w:rPr>
         <w:t xml:space="preserve"> </w:t>
       </w:r>
       <w:r>
         <w:rPr>
-          <w:rFonts w:eastAsia="Roboto"/>
+          <w:rFonts w:ascii="Arial" w:eastAsia="Roboto" w:hAnsi="Arial" w:cs="Arial"/>
         </w:rPr>
         <w:t>Git/</w:t>
       </w:r>
       <w:proofErr w:type="spellStart"/>
       <w:r>
         <w:rPr>
-          <w:rFonts w:eastAsia="Roboto"/>
+          <w:rFonts w:ascii="Arial" w:eastAsia="Roboto" w:hAnsi="Arial" w:cs="Arial"/>
         </w:rPr>
         <w:t>Github</w:t>
       </w:r>
       <w:proofErr w:type="spellEnd"/>
       <w:r>
         <w:rPr>
-          <w:rFonts w:eastAsia="Roboto"/>
+          <w:rFonts w:ascii="Arial" w:eastAsia="Roboto" w:hAnsi="Arial" w:cs="Arial"/>
         </w:rPr>
         <w:t xml:space="preserve"> </w:t>
       </w:r>
@@ -403,15 +403,27 @@
       <w:pPr>
         <w:pStyle w:val="Ttulo1"/>
         <w:rPr>
-          <w:rFonts w:eastAsia="Arial"/>
+          <w:rFonts w:ascii="Arial" w:eastAsia="Arial" w:hAnsi="Arial" w:cs="Arial"/>
           <w:u w:val="single"/>
         </w:rPr>
       </w:pPr>
       <w:r>
         <w:rPr>
-          <w:rFonts w:eastAsia="Arial"/>
-        </w:rPr>
-        <w:t>1. Glosario de Conceptos de Git</w:t>
+          <w:rFonts w:ascii="Arial" w:eastAsia="Arial" w:hAnsi="Arial" w:cs="Arial"/>
+        </w:rPr>
+        <w:t xml:space="preserve">1. </w:t>
+      </w:r>
+      <w:r>
+        <w:rPr>
+          <w:rFonts w:ascii="Arial" w:eastAsia="Arial" w:hAnsi="Arial" w:cs="Arial"/>
+        </w:rPr>
+        <w:t xml:space="preserve"> </w:t>
+      </w:r>
+      <w:r>
+        <w:rPr>
+          <w:rFonts w:ascii="Arial" w:eastAsia="Arial" w:hAnsi="Arial" w:cs="Arial"/>
+        </w:rPr>
+        <w:t>Glosario de Conceptos de Git</w:t>
       </w:r>
     </w:p>
     <w:p>
@@ -621,14 +633,26 @@
       <w:pPr>
         <w:pStyle w:val="Ttulo1"/>
         <w:rPr>
-          <w:rFonts w:eastAsia="Arial"/>
-        </w:rPr>
-      </w:pPr>
-      <w:r>
-        <w:rPr>
-          <w:rFonts w:eastAsia="Arial"/>
-        </w:rPr>
-        <w:t>2. 10 Comandos de Git Local</w:t>
+          <w:rFonts w:ascii="Arial" w:eastAsia="Arial" w:hAnsi="Arial" w:cs="Arial"/>
+        </w:rPr>
+      </w:pPr>
+      <w:r>
+        <w:rPr>
+          <w:rFonts w:ascii="Arial" w:eastAsia="Arial" w:hAnsi="Arial" w:cs="Arial"/>
+        </w:rPr>
+        <w:t xml:space="preserve">2. </w:t>
+      </w:r>
+      <w:r>
+        <w:rPr>
+          <w:rFonts w:ascii="Arial" w:eastAsia="Arial" w:hAnsi="Arial" w:cs="Arial"/>
+        </w:rPr>
+        <w:t xml:space="preserve"> </w:t>
+      </w:r>
+      <w:r>
+        <w:rPr>
+          <w:rFonts w:ascii="Arial" w:eastAsia="Arial" w:hAnsi="Arial" w:cs="Arial"/>
+        </w:rPr>
+        <w:t>10 Comandos de Git Local</w:t>
       </w:r>
     </w:p>
     <w:p>
@@ -1255,9 +1279,27 @@
       </w:pPr>
       <w:r>
         <w:rPr>
+          <w:rFonts w:ascii="Arial" w:eastAsia="Arial" w:hAnsi="Arial" w:cs="Arial"/>
+        </w:rPr>
+        <w:t>3.</w:t>
+      </w:r>
+      <w:r>
+        <w:rPr>
           <w:rFonts w:eastAsia="Arial"/>
         </w:rPr>
-        <w:t>3. GitHub y Alternativas en la Nube</w:t>
+        <w:t xml:space="preserve"> </w:t>
+      </w:r>
+      <w:r>
+        <w:rPr>
+          <w:rFonts w:eastAsia="Arial"/>
+        </w:rPr>
+        <w:t xml:space="preserve"> </w:t>
+      </w:r>
+      <w:r>
+        <w:rPr>
+          <w:rFonts w:ascii="Arial" w:eastAsia="Arial" w:hAnsi="Arial" w:cs="Arial"/>
+        </w:rPr>
+        <w:t>GitHub y Alternativas en la Nube</w:t>
       </w:r>
     </w:p>
     <w:p>
@@ -1448,24 +1490,28 @@
     </w:p>
     <w:p>
       <w:pPr>
-        <w:spacing w:after="160" w:line="259" w:lineRule="auto"/>
-        <w:rPr>
-          <w:rFonts w:ascii="Arial" w:eastAsia="Arial" w:hAnsi="Arial" w:cs="Arial"/>
-          <w:b/>
-          <w:bCs/>
-          <w:sz w:val="22"/>
-          <w:szCs w:val="22"/>
-        </w:rPr>
-      </w:pPr>
-      <w:r>
-        <w:rPr>
-          <w:rFonts w:ascii="Arial" w:eastAsia="Arial" w:hAnsi="Arial" w:cs="Arial"/>
-          <w:b/>
-          <w:bCs/>
-          <w:sz w:val="22"/>
-          <w:szCs w:val="22"/>
-        </w:rPr>
-        <w:t>4. 5 Comandos de GitHub (Remotos)</w:t>
+        <w:pStyle w:val="Ttulo1"/>
+        <w:rPr>
+          <w:rFonts w:ascii="Arial" w:eastAsia="Arial" w:hAnsi="Arial" w:cs="Arial"/>
+        </w:rPr>
+      </w:pPr>
+      <w:r>
+        <w:rPr>
+          <w:rFonts w:ascii="Arial" w:eastAsia="Arial" w:hAnsi="Arial" w:cs="Arial"/>
+        </w:rPr>
+        <w:t xml:space="preserve">4. </w:t>
+      </w:r>
+      <w:r>
+        <w:rPr>
+          <w:rFonts w:ascii="Arial" w:eastAsia="Arial" w:hAnsi="Arial" w:cs="Arial"/>
+        </w:rPr>
+        <w:t xml:space="preserve"> </w:t>
+      </w:r>
+      <w:r>
+        <w:rPr>
+          <w:rFonts w:ascii="Arial" w:eastAsia="Arial" w:hAnsi="Arial" w:cs="Arial"/>
+        </w:rPr>
+        <w:t>5 Comandos de GitHub (Remotos)</w:t>
       </w:r>
     </w:p>
     <w:p>
@@ -1812,6 +1858,36 @@
         </w:rPr>
         <w:t xml:space="preserve"> pero sin alterar el código de los archivos locales.</w:t>
       </w:r>
+    </w:p>
+    <w:p>
+      <w:pPr>
+        <w:spacing w:after="160" w:line="259" w:lineRule="auto"/>
+        <w:rPr>
+          <w:rFonts w:ascii="Arial" w:eastAsia="Arial" w:hAnsi="Arial" w:cs="Arial"/>
+          <w:sz w:val="22"/>
+          <w:szCs w:val="22"/>
+        </w:rPr>
+      </w:pPr>
+    </w:p>
+    <w:p>
+      <w:pPr>
+        <w:spacing w:after="160" w:line="259" w:lineRule="auto"/>
+        <w:rPr>
+          <w:rFonts w:ascii="Arial" w:eastAsia="Arial" w:hAnsi="Arial" w:cs="Arial"/>
+          <w:sz w:val="22"/>
+          <w:szCs w:val="22"/>
+        </w:rPr>
+      </w:pPr>
+    </w:p>
+    <w:p>
+      <w:pPr>
+        <w:spacing w:after="160" w:line="259" w:lineRule="auto"/>
+        <w:rPr>
+          <w:rFonts w:ascii="Arial" w:eastAsia="Arial" w:hAnsi="Arial" w:cs="Arial"/>
+          <w:sz w:val="22"/>
+          <w:szCs w:val="22"/>
+        </w:rPr>
+      </w:pPr>
     </w:p>
     <w:p>
       <w:pPr>
@@ -1836,15 +1912,35 @@
     </w:p>
     <w:p>
       <w:pPr>
-        <w:spacing w:after="120"/>
-        <w:jc w:val="both"/>
-        <w:rPr>
-          <w:rFonts w:ascii="Arial Narrow" w:eastAsia="Arial Narrow" w:hAnsi="Arial Narrow" w:cs="Arial Narrow"/>
-          <w:color w:val="000000"/>
-          <w:sz w:val="22"/>
-          <w:szCs w:val="22"/>
-        </w:rPr>
-      </w:pPr>
+        <w:pStyle w:val="Ttulo1"/>
+        <w:rPr>
+          <w:rFonts w:ascii="Arial" w:eastAsia="Arial Narrow" w:hAnsi="Arial" w:cs="Arial"/>
+          <w:u w:val="single"/>
+        </w:rPr>
+      </w:pPr>
+      <w:r>
+        <w:rPr>
+          <w:rFonts w:ascii="Arial" w:eastAsia="Arial Narrow" w:hAnsi="Arial" w:cs="Arial"/>
+        </w:rPr>
+        <w:t>Conclusión</w:t>
+      </w:r>
+    </w:p>
+    <w:p>
+      <w:pPr>
+        <w:rPr>
+          <w:rFonts w:eastAsia="Arial Narrow"/>
+          <w:u w:val="single"/>
+          <w:lang w:val="es-ES"/>
+        </w:rPr>
+      </w:pPr>
+      <w:r>
+        <w:rPr>
+          <w:rFonts w:ascii="Arial" w:eastAsia="Arial Narrow" w:hAnsi="Arial" w:cs="Arial"/>
+          <w:sz w:val="22"/>
+          <w:szCs w:val="22"/>
+        </w:rPr>
+        <w:t>El desarrollo de este proyecto demostró lo importante que es amarrar la programación web con un buen control de versiones. El uso de Git y GitHub demostró ser una herramienta que salva vidas en el día a día del desarrollador, permitiendo estructurar el trabajo de forma ordenada, mantener un historial claro de los cambios y, sobre todo, asegurar el respaldo del código en la nube ante cualquier imprevisto con el computador.</w:t>
+      </w:r>
     </w:p>
     <w:sectPr>
       <w:headerReference w:type="default" r:id="rId9"/>
@@ -3215,7 +3311,6 @@
   <w:style w:type="character" w:default="1" w:styleId="Fuentedeprrafopredeter">
     <w:name w:val="Default Paragraph Font"/>
     <w:uiPriority w:val="1"/>
-    <w:semiHidden/>
     <w:unhideWhenUsed/>
   </w:style>
   <w:style w:type="table" w:default="1" w:styleId="Tablanormal">

</xml_diff>

<commit_message>
docs: informe final de git
</commit_message>
<xml_diff>
--- a/Informe Git y GitHub - Damian Escobar.docx
+++ b/Informe Git y GitHub - Damian Escobar.docx
@@ -385,6 +385,171 @@
         </w:rPr>
       </w:pPr>
       <w:r>
+        <w:br w:type="page"/>
+      </w:r>
+    </w:p>
+    <w:p>
+      <w:pPr>
+        <w:spacing w:after="120"/>
+        <w:jc w:val="center"/>
+        <w:rPr>
+          <w:rFonts w:ascii="Arial Narrow" w:eastAsia="Arial Narrow" w:hAnsi="Arial Narrow" w:cs="Arial Narrow"/>
+          <w:b/>
+          <w:bCs/>
+        </w:rPr>
+      </w:pPr>
+    </w:p>
+    <w:p>
+      <w:pPr>
+        <w:pStyle w:val="Ttulo1"/>
+        <w:rPr>
+          <w:rFonts w:ascii="Arial" w:eastAsia="Arial Narrow" w:hAnsi="Arial" w:cs="Arial"/>
+          <w:u w:val="single"/>
+        </w:rPr>
+      </w:pPr>
+      <w:r>
+        <w:rPr>
+          <w:rFonts w:ascii="Arial" w:eastAsia="Arial Narrow" w:hAnsi="Arial" w:cs="Arial"/>
+          <w:u w:val="single"/>
+        </w:rPr>
+        <w:t>Introducción</w:t>
+      </w:r>
+    </w:p>
+    <w:p>
+      <w:pPr>
+        <w:rPr>
+          <w:rFonts w:ascii="Arial" w:eastAsia="Arial Narrow" w:hAnsi="Arial" w:cs="Arial"/>
+          <w:sz w:val="22"/>
+          <w:szCs w:val="22"/>
+        </w:rPr>
+      </w:pPr>
+    </w:p>
+    <w:p>
+      <w:pPr>
+        <w:rPr>
+          <w:rFonts w:ascii="Arial" w:eastAsia="Arial Narrow" w:hAnsi="Arial" w:cs="Arial"/>
+          <w:sz w:val="22"/>
+          <w:szCs w:val="22"/>
+          <w:u w:val="single"/>
+          <w:lang w:val="es-ES"/>
+        </w:rPr>
+      </w:pPr>
+      <w:r>
+        <w:rPr>
+          <w:rFonts w:ascii="Arial" w:eastAsia="Arial Narrow" w:hAnsi="Arial" w:cs="Arial"/>
+          <w:sz w:val="22"/>
+          <w:szCs w:val="22"/>
+        </w:rPr>
+        <w:t xml:space="preserve">El control de versiones es un pilar fundamental en el desarrollo de software moderno, permitiendo a los desarrolladores gestionar el historial de cambios de un proyecto de forma eficiente y segura. El presente informe detalla la integración de Git y GitHub dentro de la </w:t>
+      </w:r>
+      <w:r>
+        <w:rPr>
+          <w:rFonts w:ascii="Arial" w:eastAsia="Arial Narrow" w:hAnsi="Arial" w:cs="Arial"/>
+          <w:sz w:val="22"/>
+          <w:szCs w:val="22"/>
+        </w:rPr>
+        <w:t>p</w:t>
+      </w:r>
+      <w:r>
+        <w:rPr>
+          <w:rFonts w:ascii="Arial" w:eastAsia="Arial Narrow" w:hAnsi="Arial" w:cs="Arial"/>
+          <w:sz w:val="22"/>
+          <w:szCs w:val="22"/>
+        </w:rPr>
+        <w:t xml:space="preserve">rogramación </w:t>
+      </w:r>
+      <w:proofErr w:type="gramStart"/>
+      <w:r>
+        <w:rPr>
+          <w:rFonts w:ascii="Arial" w:eastAsia="Arial Narrow" w:hAnsi="Arial" w:cs="Arial"/>
+          <w:sz w:val="22"/>
+          <w:szCs w:val="22"/>
+        </w:rPr>
+        <w:t>w</w:t>
+      </w:r>
+      <w:r>
+        <w:rPr>
+          <w:rFonts w:ascii="Arial" w:eastAsia="Arial Narrow" w:hAnsi="Arial" w:cs="Arial"/>
+          <w:sz w:val="22"/>
+          <w:szCs w:val="22"/>
+        </w:rPr>
+        <w:t>eb ,</w:t>
+      </w:r>
+      <w:proofErr w:type="gramEnd"/>
+      <w:r>
+        <w:rPr>
+          <w:rFonts w:ascii="Arial" w:eastAsia="Arial Narrow" w:hAnsi="Arial" w:cs="Arial"/>
+          <w:sz w:val="22"/>
+          <w:szCs w:val="22"/>
+        </w:rPr>
+        <w:t xml:space="preserve"> explicando detalladamente cómo se utilizan sus comandos, para qué sirven y qué significa cada uno de ellos. A través de este documento, se </w:t>
+      </w:r>
+      <w:proofErr w:type="gramStart"/>
+      <w:r>
+        <w:rPr>
+          <w:rFonts w:ascii="Arial" w:eastAsia="Arial Narrow" w:hAnsi="Arial" w:cs="Arial"/>
+          <w:sz w:val="22"/>
+          <w:szCs w:val="22"/>
+        </w:rPr>
+        <w:t>explicara</w:t>
+      </w:r>
+      <w:proofErr w:type="gramEnd"/>
+      <w:r>
+        <w:rPr>
+          <w:rFonts w:ascii="Arial" w:eastAsia="Arial Narrow" w:hAnsi="Arial" w:cs="Arial"/>
+          <w:sz w:val="22"/>
+          <w:szCs w:val="22"/>
+        </w:rPr>
+        <w:t xml:space="preserve"> un glosario con los conceptos esenciales de la </w:t>
+      </w:r>
+      <w:proofErr w:type="gramStart"/>
+      <w:r>
+        <w:rPr>
+          <w:rFonts w:ascii="Arial" w:eastAsia="Arial Narrow" w:hAnsi="Arial" w:cs="Arial"/>
+          <w:sz w:val="22"/>
+          <w:szCs w:val="22"/>
+        </w:rPr>
+        <w:t>herramienta ,</w:t>
+      </w:r>
+      <w:proofErr w:type="gramEnd"/>
+      <w:r>
+        <w:rPr>
+          <w:rFonts w:ascii="Arial" w:eastAsia="Arial Narrow" w:hAnsi="Arial" w:cs="Arial"/>
+          <w:sz w:val="22"/>
+          <w:szCs w:val="22"/>
+        </w:rPr>
+        <w:t xml:space="preserve"> seguido por una guía técnica de diez comandos locales y cinco comandos remotos, se analizará el rol de GitHub como plataforma de alojamiento remoto y se presentarán las principales alternativas comerciales que existen en el mercado actual.</w:t>
+      </w:r>
+    </w:p>
+    <w:p>
+      <w:pPr>
+        <w:rPr>
+          <w:lang w:val="es-ES"/>
+        </w:rPr>
+      </w:pPr>
+    </w:p>
+    <w:p>
+      <w:pPr>
+        <w:pStyle w:val="Ttulo1"/>
+        <w:rPr>
+          <w:rFonts w:eastAsia="Arial Narrow"/>
+        </w:rPr>
+      </w:pPr>
+    </w:p>
+    <w:p>
+      <w:pPr>
+        <w:rPr>
+          <w:rFonts w:ascii="Arial" w:eastAsia="Arial Narrow" w:hAnsi="Arial" w:cs="Arial"/>
+          <w:sz w:val="22"/>
+          <w:szCs w:val="22"/>
+        </w:rPr>
+      </w:pPr>
+      <w:r>
+        <w:rPr>
+          <w:rFonts w:ascii="Arial" w:eastAsia="Arial Narrow" w:hAnsi="Arial" w:cs="Arial"/>
+          <w:sz w:val="22"/>
+          <w:szCs w:val="22"/>
+        </w:rPr>
         <w:br w:type="page"/>
       </w:r>
     </w:p>

</xml_diff>